<commit_message>
Ship Nuxt demo, xlsx preview layout with cell colors, and env limits.
Replace Vite examples with Nuxt; move Excel table rendering into @contract-kit/xlsx (mountXlsxPreview + getPreview styles); document browser/Node constraints and refresh Pages landing.

Co-authored-by: Cursor <cursoragent@cursor.com>
</commit_message>
<xml_diff>
--- a/examples/templates/采购合同.docx
+++ b/examples/templates/采购合同.docx
@@ -652,10 +652,10 @@
       </w:tblPr>
       <w:tblGrid>
         <w:gridCol w:w="700"/>
-        <w:gridCol w:w="2800"/>
-        <w:gridCol w:w="2200"/>
+        <w:gridCol w:w="2400"/>
+        <w:gridCol w:w="1800"/>
         <w:gridCol w:w="1400"/>
-        <w:gridCol w:w="1940"/>
+        <w:gridCol w:w="2740"/>
       </w:tblGrid>
       <w:tr>
         <w:tc>
@@ -689,7 +689,7 @@
         </w:tc>
         <w:tc>
           <w:tcPr>
-            <w:tcW w:w="2800" w:type="dxa"/>
+            <w:tcW w:w="2400" w:type="dxa"/>
             <w:shd w:val="clear" w:color="auto" w:fill="1B3A5C"/>
             <w:tcMar>
               <w:top w:w="60"/>
@@ -718,7 +718,7 @@
         </w:tc>
         <w:tc>
           <w:tcPr>
-            <w:tcW w:w="2200" w:type="dxa"/>
+            <w:tcW w:w="1800" w:type="dxa"/>
             <w:shd w:val="clear" w:color="auto" w:fill="1B3A5C"/>
             <w:tcMar>
               <w:top w:w="60"/>
@@ -741,7 +741,7 @@
                 <w:szCs w:val="20"/>
                 <w:color w:val="FFFFFF"/>
               </w:rPr>
-              <w:t xml:space="preserve">规格型号</w:t>
+              <w:t xml:space="preserve">类别</w:t>
             </w:r>
           </w:p>
         </w:tc>
@@ -776,7 +776,7 @@
         </w:tc>
         <w:tc>
           <w:tcPr>
-            <w:tcW w:w="1940" w:type="dxa"/>
+            <w:tcW w:w="2740" w:type="dxa"/>
             <w:shd w:val="clear" w:color="auto" w:fill="1B3A5C"/>
             <w:tcMar>
               <w:top w:w="60"/>
@@ -833,7 +833,7 @@
         </w:tc>
         <w:tc>
           <w:tcPr>
-            <w:tcW w:w="2800" w:type="dxa"/>
+            <w:tcW w:w="2400" w:type="dxa"/>
             <w:shd w:val="clear" w:color="auto" w:fill="F7F3EA"/>
             <w:tcMar>
               <w:top w:w="60"/>
@@ -859,7 +859,7 @@
         </w:tc>
         <w:tc>
           <w:tcPr>
-            <w:tcW w:w="2200" w:type="dxa"/>
+            <w:tcW w:w="1800" w:type="dxa"/>
             <w:shd w:val="clear" w:color="auto" w:fill="F7F3EA"/>
             <w:tcMar>
               <w:top w:w="60"/>
@@ -879,7 +879,7 @@
                 <w:sz w:val="20"/>
                 <w:szCs w:val="20"/>
               </w:rPr>
-              <w:t xml:space="preserve">{{items.spec}}</w:t>
+              <w:t xml:space="preserve">{{items.category:select}}</w:t>
             </w:r>
           </w:p>
         </w:tc>
@@ -911,7 +911,7 @@
         </w:tc>
         <w:tc>
           <w:tcPr>
-            <w:tcW w:w="1940" w:type="dxa"/>
+            <w:tcW w:w="2740" w:type="dxa"/>
             <w:shd w:val="clear" w:color="auto" w:fill="F7F3EA"/>
             <w:tcMar>
               <w:top w:w="60"/>
@@ -939,7 +939,7 @@
       <w:tr>
         <w:tc>
           <w:tcPr>
-            <w:tcW w:w="7100" w:type="dxa"/>
+            <w:tcW w:w="6300" w:type="dxa"/>
             <w:gridSpan w:val="4"/>
             <w:shd w:val="clear" w:color="auto" w:fill="C4A35A"/>
           </w:tcPr>
@@ -963,7 +963,7 @@
         </w:tc>
         <w:tc>
           <w:tcPr>
-            <w:tcW w:w="1940" w:type="dxa"/>
+            <w:tcW w:w="2740" w:type="dxa"/>
             <w:shd w:val="clear" w:color="auto" w:fill="C4A35A"/>
             <w:tcMar>
               <w:top w:w="60"/>
@@ -1164,7 +1164,7 @@
                 <w:szCs w:val="20"/>
                 <w:color w:val="1B3A5C"/>
               </w:rPr>
-              <w:t xml:space="preserve">付款期限</w:t>
+              <w:t xml:space="preserve">交货区域</w:t>
             </w:r>
           </w:p>
         </w:tc>
@@ -1190,7 +1190,7 @@
                 <w:sz w:val="20"/>
                 <w:szCs w:val="20"/>
               </w:rPr>
-              <w:t xml:space="preserve">{{payTerm}}</w:t>
+              <w:t xml:space="preserve">{{deliveryRegions:multiselect}}</w:t>
             </w:r>
           </w:p>
         </w:tc>
@@ -1221,7 +1221,7 @@
                 <w:szCs w:val="20"/>
                 <w:color w:val="1B3A5C"/>
               </w:rPr>
-              <w:t xml:space="preserve">交货日期</w:t>
+              <w:t xml:space="preserve">付款期限</w:t>
             </w:r>
           </w:p>
         </w:tc>
@@ -1247,7 +1247,7 @@
                 <w:sz w:val="20"/>
                 <w:szCs w:val="20"/>
               </w:rPr>
-              <w:t xml:space="preserve">{{deliveryDate:date}}</w:t>
+              <w:t xml:space="preserve">{{payTerm}}</w:t>
             </w:r>
           </w:p>
         </w:tc>
@@ -1278,7 +1278,7 @@
                 <w:szCs w:val="20"/>
                 <w:color w:val="1B3A5C"/>
               </w:rPr>
-              <w:t xml:space="preserve">交货地点</w:t>
+              <w:t xml:space="preserve">交货日期</w:t>
             </w:r>
           </w:p>
         </w:tc>
@@ -1304,7 +1304,7 @@
                 <w:sz w:val="20"/>
                 <w:szCs w:val="20"/>
               </w:rPr>
-              <w:t xml:space="preserve">{{deliveryPlace}}</w:t>
+              <w:t xml:space="preserve">{{deliveryDate:date}}</w:t>
             </w:r>
           </w:p>
         </w:tc>
@@ -1335,7 +1335,7 @@
                 <w:szCs w:val="20"/>
                 <w:color w:val="1B3A5C"/>
               </w:rPr>
-              <w:t xml:space="preserve">质保期限</w:t>
+              <w:t xml:space="preserve">交货地点</w:t>
             </w:r>
           </w:p>
         </w:tc>
@@ -1343,6 +1343,63 @@
           <w:tcPr>
             <w:tcW w:w="6440" w:type="dxa"/>
             <w:shd w:val="clear" w:color="auto" w:fill="FFFFFF"/>
+            <w:tcMar>
+              <w:top w:w="60"/>
+              <w:left w:w="100"/>
+              <w:bottom w:w="60"/>
+              <w:right w:w="100"/>
+            </w:tcMar>
+          </w:tcPr>
+          <w:p>
+            <w:pPr>
+              <w:jc w:val="left"/>
+              <w:spacing w:before="40" w:after="40" w:line="360" w:lineRule="auto"/>
+            </w:pPr>
+            <w:r>
+              <w:rPr>
+                <w:rFonts w:ascii="宋体" w:hAnsi="宋体" w:eastAsia="宋体"/>
+                <w:sz w:val="20"/>
+                <w:szCs w:val="20"/>
+              </w:rPr>
+              <w:t xml:space="preserve">{{deliveryPlace}}</w:t>
+            </w:r>
+          </w:p>
+        </w:tc>
+      </w:tr>
+      <w:tr>
+        <w:tc>
+          <w:tcPr>
+            <w:tcW w:w="2600" w:type="dxa"/>
+            <w:shd w:val="clear" w:color="auto" w:fill="E8EEF5"/>
+            <w:tcMar>
+              <w:top w:w="60"/>
+              <w:left w:w="100"/>
+              <w:bottom w:w="60"/>
+              <w:right w:w="100"/>
+            </w:tcMar>
+          </w:tcPr>
+          <w:p>
+            <w:pPr>
+              <w:jc w:val="left"/>
+              <w:spacing w:before="40" w:after="40" w:line="360" w:lineRule="auto"/>
+            </w:pPr>
+            <w:r>
+              <w:rPr>
+                <w:rFonts w:ascii="宋体" w:hAnsi="宋体" w:eastAsia="宋体"/>
+                <w:b/>
+                <w:bCs/>
+                <w:sz w:val="20"/>
+                <w:szCs w:val="20"/>
+                <w:color w:val="1B3A5C"/>
+              </w:rPr>
+              <w:t xml:space="preserve">质保期限</w:t>
+            </w:r>
+          </w:p>
+        </w:tc>
+        <w:tc>
+          <w:tcPr>
+            <w:tcW w:w="6440" w:type="dxa"/>
+            <w:shd w:val="clear" w:color="auto" w:fill="EEF4FA"/>
             <w:tcMar>
               <w:top w:w="60"/>
               <w:left w:w="100"/>
@@ -1623,6 +1680,63 @@
                 <w:szCs w:val="20"/>
               </w:rPr>
               <w:t xml:space="preserve">{{filledAt:display}}</w:t>
+            </w:r>
+          </w:p>
+        </w:tc>
+      </w:tr>
+      <w:tr>
+        <w:tc>
+          <w:tcPr>
+            <w:tcW w:w="2600" w:type="dxa"/>
+            <w:shd w:val="clear" w:color="auto" w:fill="E8EEF5"/>
+            <w:tcMar>
+              <w:top w:w="60"/>
+              <w:left w:w="100"/>
+              <w:bottom w:w="60"/>
+              <w:right w:w="100"/>
+            </w:tcMar>
+          </w:tcPr>
+          <w:p>
+            <w:pPr>
+              <w:jc w:val="left"/>
+              <w:spacing w:before="40" w:after="40" w:line="360" w:lineRule="auto"/>
+            </w:pPr>
+            <w:r>
+              <w:rPr>
+                <w:rFonts w:ascii="宋体" w:hAnsi="宋体" w:eastAsia="宋体"/>
+                <w:b/>
+                <w:bCs/>
+                <w:sz w:val="20"/>
+                <w:szCs w:val="20"/>
+                <w:color w:val="1B3A5C"/>
+              </w:rPr>
+              <w:t xml:space="preserve">附件图片</w:t>
+            </w:r>
+          </w:p>
+        </w:tc>
+        <w:tc>
+          <w:tcPr>
+            <w:tcW w:w="6440" w:type="dxa"/>
+            <w:shd w:val="clear" w:color="auto" w:fill="EEF4FA"/>
+            <w:tcMar>
+              <w:top w:w="60"/>
+              <w:left w:w="100"/>
+              <w:bottom w:w="60"/>
+              <w:right w:w="100"/>
+            </w:tcMar>
+          </w:tcPr>
+          <w:p>
+            <w:pPr>
+              <w:jc w:val="left"/>
+              <w:spacing w:before="40" w:after="40" w:line="360" w:lineRule="auto"/>
+            </w:pPr>
+            <w:r>
+              <w:rPr>
+                <w:rFonts w:ascii="宋体" w:hAnsi="宋体" w:eastAsia="宋体"/>
+                <w:sz w:val="20"/>
+                <w:szCs w:val="20"/>
+              </w:rPr>
+              <w:t xml:space="preserve">{{stamp:image}}</w:t>
             </w:r>
           </w:p>
         </w:tc>

</xml_diff>

<commit_message>
Let definition own field type and export format, not the Word marker.
Documents only keep {{name}} anchors; outputFormat formats dates, numbers, and option labels on export while data stays canonical.

Co-authored-by: Cursor <cursoragent@cursor.com>
</commit_message>
<xml_diff>
--- a/examples/templates/采购合同.docx
+++ b/examples/templates/采购合同.docx
@@ -879,7 +879,7 @@
                 <w:sz w:val="20"/>
                 <w:szCs w:val="20"/>
               </w:rPr>
-              <w:t xml:space="preserve">{{items.category:select}}</w:t>
+              <w:t xml:space="preserve">{{items.category}}</w:t>
             </w:r>
           </w:p>
         </w:tc>
@@ -905,7 +905,7 @@
                 <w:sz w:val="20"/>
                 <w:szCs w:val="20"/>
               </w:rPr>
-              <w:t xml:space="preserve">{{items.qty:number}}</w:t>
+              <w:t xml:space="preserve">{{items.qty}}</w:t>
             </w:r>
           </w:p>
         </w:tc>
@@ -931,7 +931,7 @@
                 <w:sz w:val="20"/>
                 <w:szCs w:val="20"/>
               </w:rPr>
-              <w:t xml:space="preserve">{{items.unitPrice:number}}</w:t>
+              <w:t xml:space="preserve">{{items.unitPrice}}</w:t>
             </w:r>
           </w:p>
         </w:tc>
@@ -986,7 +986,7 @@
                 <w:szCs w:val="20"/>
                 <w:color w:val="1B3A5C"/>
               </w:rPr>
-              <w:t xml:space="preserve">{{amount:number}}</w:t>
+              <w:t xml:space="preserve">{{amount}}</w:t>
             </w:r>
           </w:p>
         </w:tc>
@@ -1133,7 +1133,7 @@
                 <w:sz w:val="20"/>
                 <w:szCs w:val="20"/>
               </w:rPr>
-              <w:t xml:space="preserve">{{payMethod:select}}</w:t>
+              <w:t xml:space="preserve">{{payMethod}}</w:t>
             </w:r>
           </w:p>
         </w:tc>
@@ -1190,7 +1190,7 @@
                 <w:sz w:val="20"/>
                 <w:szCs w:val="20"/>
               </w:rPr>
-              <w:t xml:space="preserve">{{deliveryRegions:multiselect}}</w:t>
+              <w:t xml:space="preserve">{{deliveryRegions}}</w:t>
             </w:r>
           </w:p>
         </w:tc>
@@ -1304,7 +1304,7 @@
                 <w:sz w:val="20"/>
                 <w:szCs w:val="20"/>
               </w:rPr>
-              <w:t xml:space="preserve">{{deliveryDate:date}}</w:t>
+              <w:t xml:space="preserve">{{deliveryDate}}</w:t>
             </w:r>
           </w:p>
         </w:tc>
@@ -1565,7 +1565,7 @@
                 <w:sz w:val="20"/>
                 <w:szCs w:val="20"/>
               </w:rPr>
-              <w:t xml:space="preserve">{{signDate:date}}</w:t>
+              <w:t xml:space="preserve">{{signDate}}</w:t>
             </w:r>
           </w:p>
         </w:tc>
@@ -1622,7 +1622,7 @@
                 <w:sz w:val="20"/>
                 <w:szCs w:val="20"/>
               </w:rPr>
-              <w:t xml:space="preserve">{{note:textarea}}</w:t>
+              <w:t xml:space="preserve">{{note}}</w:t>
             </w:r>
           </w:p>
         </w:tc>
@@ -1679,7 +1679,7 @@
                 <w:sz w:val="20"/>
                 <w:szCs w:val="20"/>
               </w:rPr>
-              <w:t xml:space="preserve">{{filledAt:display}}</w:t>
+              <w:t xml:space="preserve">{{filledAt}}</w:t>
             </w:r>
           </w:p>
         </w:tc>
@@ -1736,7 +1736,7 @@
                 <w:sz w:val="20"/>
                 <w:szCs w:val="20"/>
               </w:rPr>
-              <w:t xml:space="preserve">{{stamp:image}}</w:t>
+              <w:t xml:space="preserve">{{stamp}}</w:t>
             </w:r>
           </w:p>
         </w:tc>
@@ -1882,7 +1882,7 @@
                 <w:sz w:val="20"/>
                 <w:szCs w:val="20"/>
               </w:rPr>
-              <w:t xml:space="preserve">日期：{{signDate:date}}</w:t>
+              <w:t xml:space="preserve">日期：{{signDate}}</w:t>
             </w:r>
           </w:p>
         </w:tc>
@@ -1936,7 +1936,7 @@
                 <w:sz w:val="20"/>
                 <w:szCs w:val="20"/>
               </w:rPr>
-              <w:t xml:space="preserve">日期：{{signDate:date}}</w:t>
+              <w:t xml:space="preserve">日期：{{signDate}}</w:t>
             </w:r>
           </w:p>
         </w:tc>

</xml_diff>